<commit_message>
docs(er): refinamento de layout e integridade do documento Word da Etapa 1
</commit_message>
<xml_diff>
--- a/docs/Entregas-Eng.-de-Requisitos/Etapa-1/Trabalho Final ER - 1 - Análise de Negócio - Clinix.docx
+++ b/docs/Entregas-Eng.-de-Requisitos/Etapa-1/Trabalho Final ER - 1 - Análise de Negócio - Clinix.docx
@@ -106,6 +106,7 @@
     </w:p>
     <w:p>
       <w:pPr>
+        <w:pStyle w:val="ListBullet"/>
         <w:spacing w:after="40" w:line="276" w:lineRule="auto"/>
         <w:jc w:val="both"/>
       </w:pPr>
@@ -117,11 +118,12 @@
           <w:color w:val="334155"/>
           <w:sz w:val="22"/>
         </w:rPr>
-        <w:t>• Davi Felinto</w:t>
+        <w:t>Davi Felinto</w:t>
       </w:r>
     </w:p>
     <w:p>
       <w:pPr>
+        <w:pStyle w:val="ListBullet"/>
         <w:spacing w:after="40" w:line="276" w:lineRule="auto"/>
         <w:jc w:val="both"/>
       </w:pPr>
@@ -133,11 +135,12 @@
           <w:color w:val="334155"/>
           <w:sz w:val="22"/>
         </w:rPr>
-        <w:t>• Isaac Soares</w:t>
+        <w:t>Isaac Soares</w:t>
       </w:r>
     </w:p>
     <w:p>
       <w:pPr>
+        <w:pStyle w:val="ListBullet"/>
         <w:spacing w:after="40" w:line="276" w:lineRule="auto"/>
         <w:jc w:val="both"/>
       </w:pPr>
@@ -149,11 +152,12 @@
           <w:color w:val="334155"/>
           <w:sz w:val="22"/>
         </w:rPr>
-        <w:t>• Miguel Dias</w:t>
+        <w:t>Miguel Dias</w:t>
       </w:r>
     </w:p>
     <w:p>
       <w:pPr>
+        <w:pStyle w:val="ListBullet"/>
         <w:spacing w:after="40" w:line="276" w:lineRule="auto"/>
         <w:jc w:val="both"/>
       </w:pPr>
@@ -165,11 +169,12 @@
           <w:color w:val="334155"/>
           <w:sz w:val="22"/>
         </w:rPr>
-        <w:t>• Lucas Evaldo</w:t>
+        <w:t>Lucas Evaldo</w:t>
       </w:r>
     </w:p>
     <w:p>
       <w:pPr>
+        <w:pStyle w:val="ListBullet"/>
         <w:spacing w:after="40" w:line="276" w:lineRule="auto"/>
         <w:jc w:val="both"/>
       </w:pPr>
@@ -181,7 +186,7 @@
           <w:color w:val="334155"/>
           <w:sz w:val="22"/>
         </w:rPr>
-        <w:t>• Vanessa Mendoça</w:t>
+        <w:t>Vanessa Mendoça</w:t>
       </w:r>
     </w:p>
     <w:p>
@@ -475,14 +480,15 @@
     </w:p>
     <w:p>
       <w:pPr>
+        <w:pStyle w:val="Heading1"/>
         <w:keepNext/>
-        <w:spacing w:before="320" w:after="160"/>
+        <w:spacing w:before="280" w:after="120"/>
       </w:pPr>
       <w:r>
         <w:rPr>
           <w:rFonts w:ascii="Calibri" w:hAnsi="Calibri"/>
           <w:b/>
-          <w:color w:val="0F172A"/>
+          <w:color w:val="000000"/>
           <w:sz w:val="28"/>
         </w:rPr>
         <w:t>1. Análise Institucional e Funcional</w:t>
@@ -520,14 +526,15 @@
     </w:p>
     <w:p>
       <w:pPr>
+        <w:pStyle w:val="Heading2"/>
         <w:keepNext/>
-        <w:spacing w:before="240" w:after="120"/>
+        <w:spacing w:before="240" w:after="80"/>
       </w:pPr>
       <w:r>
         <w:rPr>
           <w:rFonts w:ascii="Calibri" w:hAnsi="Calibri"/>
           <w:b/>
-          <w:color w:val="1E293B"/>
+          <w:color w:val="000000"/>
           <w:sz w:val="24"/>
         </w:rPr>
         <w:t>1.1 Áreas de Negócio Relacionadas</w:t>
@@ -550,8 +557,8 @@
     </w:p>
     <w:p>
       <w:pPr>
-        <w:pStyle w:val="ListBullet"/>
-        <w:spacing w:after="80" w:line="276" w:lineRule="auto"/>
+        <w:spacing w:after="60" w:line="276" w:lineRule="auto"/>
+        <w:ind w:left="360"/>
         <w:jc w:val="both"/>
       </w:pPr>
       <w:r>
@@ -574,8 +581,8 @@
     </w:p>
     <w:p>
       <w:pPr>
-        <w:pStyle w:val="ListBullet"/>
-        <w:spacing w:after="80" w:line="276" w:lineRule="auto"/>
+        <w:spacing w:after="60" w:line="276" w:lineRule="auto"/>
+        <w:ind w:left="360"/>
         <w:jc w:val="both"/>
       </w:pPr>
       <w:r>
@@ -598,8 +605,8 @@
     </w:p>
     <w:p>
       <w:pPr>
-        <w:pStyle w:val="ListBullet"/>
-        <w:spacing w:after="80" w:line="276" w:lineRule="auto"/>
+        <w:spacing w:after="60" w:line="276" w:lineRule="auto"/>
+        <w:ind w:left="360"/>
         <w:jc w:val="both"/>
       </w:pPr>
       <w:r>
@@ -622,8 +629,8 @@
     </w:p>
     <w:p>
       <w:pPr>
-        <w:pStyle w:val="ListBullet"/>
-        <w:spacing w:after="80" w:line="276" w:lineRule="auto"/>
+        <w:spacing w:after="60" w:line="276" w:lineRule="auto"/>
+        <w:ind w:left="360"/>
         <w:jc w:val="both"/>
       </w:pPr>
       <w:r>
@@ -646,8 +653,8 @@
     </w:p>
     <w:p>
       <w:pPr>
-        <w:pStyle w:val="ListBullet"/>
-        <w:spacing w:after="80" w:line="276" w:lineRule="auto"/>
+        <w:spacing w:after="60" w:line="276" w:lineRule="auto"/>
+        <w:ind w:left="360"/>
         <w:jc w:val="both"/>
       </w:pPr>
       <w:r>
@@ -670,14 +677,15 @@
     </w:p>
     <w:p>
       <w:pPr>
+        <w:pStyle w:val="Heading2"/>
         <w:keepNext/>
-        <w:spacing w:before="240" w:after="120"/>
+        <w:spacing w:before="240" w:after="80"/>
       </w:pPr>
       <w:r>
         <w:rPr>
           <w:rFonts w:ascii="Calibri" w:hAnsi="Calibri"/>
           <w:b/>
-          <w:color w:val="1E293B"/>
+          <w:color w:val="000000"/>
           <w:sz w:val="24"/>
         </w:rPr>
         <w:t>1.2 Identificação dos Principais Stakeholders</w:t>
@@ -711,7 +719,7 @@
           <w:color w:val="0F172A"/>
           <w:sz w:val="22"/>
         </w:rPr>
-        <w:t xml:space="preserve">• Amanda Souza Peixoto (Cliente e Patrocinadora): </w:t>
+        <w:t xml:space="preserve">Amanda Souza Peixoto (Cliente e Patrocinadora): </w:t>
       </w:r>
       <w:r>
         <w:rPr>
@@ -735,7 +743,7 @@
           <w:color w:val="0F172A"/>
           <w:sz w:val="22"/>
         </w:rPr>
-        <w:t xml:space="preserve">• Recepcionistas e Secretárias: </w:t>
+        <w:t xml:space="preserve">Recepcionistas e Secretárias: </w:t>
       </w:r>
       <w:r>
         <w:rPr>
@@ -759,7 +767,7 @@
           <w:color w:val="0F172A"/>
           <w:sz w:val="22"/>
         </w:rPr>
-        <w:t xml:space="preserve">• Pacientes (Clientes Finais): </w:t>
+        <w:t xml:space="preserve">Pacientes (Clientes Finais): </w:t>
       </w:r>
       <w:r>
         <w:rPr>
@@ -783,7 +791,7 @@
           <w:color w:val="0F172A"/>
           <w:sz w:val="22"/>
         </w:rPr>
-        <w:t xml:space="preserve">• Laboratórios Parceiros Terceirizados: </w:t>
+        <w:t xml:space="preserve">Laboratórios Parceiros Terceirizados: </w:t>
       </w:r>
       <w:r>
         <w:rPr>
@@ -807,7 +815,7 @@
           <w:color w:val="0F172A"/>
           <w:sz w:val="22"/>
         </w:rPr>
-        <w:t xml:space="preserve">• Órgãos Reguladores (Conselho Federal de Medicina - CFM e ANPD): </w:t>
+        <w:t xml:space="preserve">Órgãos Reguladores (Conselho Federal de Medicina - CFM e ANPD): </w:t>
       </w:r>
       <w:r>
         <w:rPr>
@@ -820,14 +828,15 @@
     </w:p>
     <w:p>
       <w:pPr>
+        <w:pStyle w:val="Heading1"/>
         <w:keepNext/>
-        <w:spacing w:before="320" w:after="160"/>
+        <w:spacing w:before="280" w:after="120"/>
       </w:pPr>
       <w:r>
         <w:rPr>
           <w:rFonts w:ascii="Calibri" w:hAnsi="Calibri"/>
           <w:b/>
-          <w:color w:val="0F172A"/>
+          <w:color w:val="000000"/>
           <w:sz w:val="28"/>
         </w:rPr>
         <w:t>2. Mapeamento do Processo Atual (AS IS)</w:t>
@@ -865,8 +874,8 @@
     </w:p>
     <w:p>
       <w:pPr>
-        <w:pStyle w:val="ListBullet"/>
-        <w:spacing w:after="80" w:line="276" w:lineRule="auto"/>
+        <w:spacing w:after="60" w:line="276" w:lineRule="auto"/>
+        <w:ind w:left="360"/>
         <w:jc w:val="both"/>
       </w:pPr>
       <w:r>
@@ -889,8 +898,8 @@
     </w:p>
     <w:p>
       <w:pPr>
-        <w:pStyle w:val="ListBullet"/>
-        <w:spacing w:after="80" w:line="276" w:lineRule="auto"/>
+        <w:spacing w:after="60" w:line="276" w:lineRule="auto"/>
+        <w:ind w:left="360"/>
         <w:jc w:val="both"/>
       </w:pPr>
       <w:r>
@@ -913,8 +922,8 @@
     </w:p>
     <w:p>
       <w:pPr>
-        <w:pStyle w:val="ListBullet"/>
-        <w:spacing w:after="80" w:line="276" w:lineRule="auto"/>
+        <w:spacing w:after="60" w:line="276" w:lineRule="auto"/>
+        <w:ind w:left="360"/>
         <w:jc w:val="both"/>
       </w:pPr>
       <w:r>
@@ -937,8 +946,8 @@
     </w:p>
     <w:p>
       <w:pPr>
-        <w:pStyle w:val="ListBullet"/>
-        <w:spacing w:after="80" w:line="276" w:lineRule="auto"/>
+        <w:spacing w:after="60" w:line="276" w:lineRule="auto"/>
+        <w:ind w:left="360"/>
         <w:jc w:val="both"/>
       </w:pPr>
       <w:r>
@@ -961,8 +970,8 @@
     </w:p>
     <w:p>
       <w:pPr>
-        <w:pStyle w:val="ListBullet"/>
-        <w:spacing w:after="80" w:line="276" w:lineRule="auto"/>
+        <w:spacing w:after="60" w:line="276" w:lineRule="auto"/>
+        <w:ind w:left="360"/>
         <w:jc w:val="both"/>
       </w:pPr>
       <w:r>
@@ -985,8 +994,8 @@
     </w:p>
     <w:p>
       <w:pPr>
-        <w:pStyle w:val="ListBullet"/>
-        <w:spacing w:after="80" w:line="276" w:lineRule="auto"/>
+        <w:spacing w:after="60" w:line="276" w:lineRule="auto"/>
+        <w:ind w:left="360"/>
         <w:jc w:val="both"/>
       </w:pPr>
       <w:r>
@@ -1009,8 +1018,8 @@
     </w:p>
     <w:p>
       <w:pPr>
-        <w:pStyle w:val="ListBullet"/>
-        <w:spacing w:after="80" w:line="276" w:lineRule="auto"/>
+        <w:spacing w:after="60" w:line="276" w:lineRule="auto"/>
+        <w:ind w:left="360"/>
         <w:jc w:val="both"/>
       </w:pPr>
       <w:r>
@@ -1048,14 +1057,15 @@
     </w:p>
     <w:p>
       <w:pPr>
+        <w:pStyle w:val="Heading1"/>
         <w:keepNext/>
-        <w:spacing w:before="320" w:after="160"/>
+        <w:spacing w:before="280" w:after="120"/>
       </w:pPr>
       <w:r>
         <w:rPr>
           <w:rFonts w:ascii="Calibri" w:hAnsi="Calibri"/>
           <w:b/>
-          <w:color w:val="0F172A"/>
+          <w:color w:val="000000"/>
           <w:sz w:val="28"/>
         </w:rPr>
         <w:t>3. Identificação do(s) Problema(s) ou Necessidade(s)</w:t>
@@ -1649,14 +1659,15 @@
     </w:p>
     <w:p>
       <w:pPr>
+        <w:pStyle w:val="Heading1"/>
         <w:keepNext/>
-        <w:spacing w:before="320" w:after="160"/>
+        <w:spacing w:before="280" w:after="120"/>
       </w:pPr>
       <w:r>
         <w:rPr>
           <w:rFonts w:ascii="Calibri" w:hAnsi="Calibri"/>
           <w:b/>
-          <w:color w:val="0F172A"/>
+          <w:color w:val="000000"/>
           <w:sz w:val="28"/>
         </w:rPr>
         <w:t>4. Proposta de Solução</w:t>
@@ -1690,7 +1701,7 @@
           <w:color w:val="0F172A"/>
           <w:sz w:val="22"/>
         </w:rPr>
-        <w:t xml:space="preserve">• Backend Robusto em C# (.NET 8): </w:t>
+        <w:t xml:space="preserve">Backend Robusto em C# (.NET 8): </w:t>
       </w:r>
       <w:r>
         <w:rPr>
@@ -1714,7 +1725,7 @@
           <w:color w:val="0F172A"/>
           <w:sz w:val="22"/>
         </w:rPr>
-        <w:t xml:space="preserve">• Banco de Dados Relacional MySQL 8.0/8.4: </w:t>
+        <w:t xml:space="preserve">Banco de Dados Relacional MySQL 8.0/8.4: </w:t>
       </w:r>
       <w:r>
         <w:rPr>
@@ -1738,7 +1749,7 @@
           <w:color w:val="0F172A"/>
           <w:sz w:val="22"/>
         </w:rPr>
-        <w:t xml:space="preserve">• Frontend Web Responsivo (HTML5 / TailwindCSS / React): </w:t>
+        <w:t xml:space="preserve">Frontend Web Responsivo (HTML5 / TailwindCSS / React): </w:t>
       </w:r>
       <w:r>
         <w:rPr>
@@ -1751,14 +1762,15 @@
     </w:p>
     <w:p>
       <w:pPr>
+        <w:pStyle w:val="Heading2"/>
         <w:keepNext/>
-        <w:spacing w:before="240" w:after="120"/>
+        <w:spacing w:before="240" w:after="80"/>
       </w:pPr>
       <w:r>
         <w:rPr>
           <w:rFonts w:ascii="Calibri" w:hAnsi="Calibri"/>
           <w:b/>
-          <w:color w:val="1E293B"/>
+          <w:color w:val="000000"/>
           <w:sz w:val="24"/>
         </w:rPr>
         <w:t>4.1 Mapeamento do Processo Proposto (TO BE)</w:t>
@@ -1781,8 +1793,8 @@
     </w:p>
     <w:p>
       <w:pPr>
-        <w:pStyle w:val="ListBullet"/>
-        <w:spacing w:after="80" w:line="276" w:lineRule="auto"/>
+        <w:spacing w:after="60" w:line="276" w:lineRule="auto"/>
+        <w:ind w:left="360"/>
         <w:jc w:val="both"/>
       </w:pPr>
       <w:r>
@@ -1805,8 +1817,8 @@
     </w:p>
     <w:p>
       <w:pPr>
-        <w:pStyle w:val="ListBullet"/>
-        <w:spacing w:after="80" w:line="276" w:lineRule="auto"/>
+        <w:spacing w:after="60" w:line="276" w:lineRule="auto"/>
+        <w:ind w:left="360"/>
         <w:jc w:val="both"/>
       </w:pPr>
       <w:r>
@@ -1829,8 +1841,8 @@
     </w:p>
     <w:p>
       <w:pPr>
-        <w:pStyle w:val="ListBullet"/>
-        <w:spacing w:after="80" w:line="276" w:lineRule="auto"/>
+        <w:spacing w:after="60" w:line="276" w:lineRule="auto"/>
+        <w:ind w:left="360"/>
         <w:jc w:val="both"/>
       </w:pPr>
       <w:r>
@@ -1853,8 +1865,8 @@
     </w:p>
     <w:p>
       <w:pPr>
-        <w:pStyle w:val="ListBullet"/>
-        <w:spacing w:after="80" w:line="276" w:lineRule="auto"/>
+        <w:spacing w:after="60" w:line="276" w:lineRule="auto"/>
+        <w:ind w:left="360"/>
         <w:jc w:val="both"/>
       </w:pPr>
       <w:r>
@@ -1877,8 +1889,8 @@
     </w:p>
     <w:p>
       <w:pPr>
-        <w:pStyle w:val="ListBullet"/>
-        <w:spacing w:after="80" w:line="276" w:lineRule="auto"/>
+        <w:spacing w:after="60" w:line="276" w:lineRule="auto"/>
+        <w:ind w:left="360"/>
         <w:jc w:val="both"/>
       </w:pPr>
       <w:r>
@@ -1901,8 +1913,8 @@
     </w:p>
     <w:p>
       <w:pPr>
-        <w:pStyle w:val="ListBullet"/>
-        <w:spacing w:after="80" w:line="276" w:lineRule="auto"/>
+        <w:spacing w:after="60" w:line="276" w:lineRule="auto"/>
+        <w:ind w:left="360"/>
         <w:jc w:val="both"/>
       </w:pPr>
       <w:r>
@@ -1925,8 +1937,8 @@
     </w:p>
     <w:p>
       <w:pPr>
-        <w:pStyle w:val="ListBullet"/>
-        <w:spacing w:after="80" w:line="276" w:lineRule="auto"/>
+        <w:spacing w:after="60" w:line="276" w:lineRule="auto"/>
+        <w:ind w:left="360"/>
         <w:jc w:val="both"/>
       </w:pPr>
       <w:r>
@@ -1949,8 +1961,8 @@
     </w:p>
     <w:p>
       <w:pPr>
-        <w:pStyle w:val="ListBullet"/>
-        <w:spacing w:after="80" w:line="276" w:lineRule="auto"/>
+        <w:spacing w:after="60" w:line="276" w:lineRule="auto"/>
+        <w:ind w:left="360"/>
         <w:jc w:val="both"/>
       </w:pPr>
       <w:r>
@@ -1973,8 +1985,8 @@
     </w:p>
     <w:p>
       <w:pPr>
-        <w:pStyle w:val="ListBullet"/>
-        <w:spacing w:after="80" w:line="276" w:lineRule="auto"/>
+        <w:spacing w:after="60" w:line="276" w:lineRule="auto"/>
+        <w:ind w:left="360"/>
         <w:jc w:val="both"/>
       </w:pPr>
       <w:r>
@@ -1997,14 +2009,15 @@
     </w:p>
     <w:p>
       <w:pPr>
+        <w:pStyle w:val="Heading2"/>
         <w:keepNext/>
-        <w:spacing w:before="240" w:after="120"/>
+        <w:spacing w:before="240" w:after="80"/>
       </w:pPr>
       <w:r>
         <w:rPr>
           <w:rFonts w:ascii="Calibri" w:hAnsi="Calibri"/>
           <w:b/>
-          <w:color w:val="1E293B"/>
+          <w:color w:val="000000"/>
           <w:sz w:val="24"/>
         </w:rPr>
         <w:t>4.2 Objetivos da Solução</w:t>
@@ -2042,8 +2055,8 @@
     </w:p>
     <w:p>
       <w:pPr>
-        <w:pStyle w:val="ListBullet"/>
-        <w:spacing w:after="80" w:line="276" w:lineRule="auto"/>
+        <w:spacing w:after="60" w:line="276" w:lineRule="auto"/>
+        <w:ind w:left="360"/>
         <w:jc w:val="both"/>
       </w:pPr>
       <w:r>
@@ -2066,8 +2079,8 @@
     </w:p>
     <w:p>
       <w:pPr>
-        <w:pStyle w:val="ListBullet"/>
-        <w:spacing w:after="80" w:line="276" w:lineRule="auto"/>
+        <w:spacing w:after="60" w:line="276" w:lineRule="auto"/>
+        <w:ind w:left="360"/>
         <w:jc w:val="both"/>
       </w:pPr>
       <w:r>
@@ -2090,8 +2103,8 @@
     </w:p>
     <w:p>
       <w:pPr>
-        <w:pStyle w:val="ListBullet"/>
-        <w:spacing w:after="80" w:line="276" w:lineRule="auto"/>
+        <w:spacing w:after="60" w:line="276" w:lineRule="auto"/>
+        <w:ind w:left="360"/>
         <w:jc w:val="both"/>
       </w:pPr>
       <w:r>
@@ -2114,8 +2127,8 @@
     </w:p>
     <w:p>
       <w:pPr>
-        <w:pStyle w:val="ListBullet"/>
-        <w:spacing w:after="80" w:line="276" w:lineRule="auto"/>
+        <w:spacing w:after="60" w:line="276" w:lineRule="auto"/>
+        <w:ind w:left="360"/>
         <w:jc w:val="both"/>
       </w:pPr>
       <w:r>
@@ -2138,8 +2151,8 @@
     </w:p>
     <w:p>
       <w:pPr>
-        <w:pStyle w:val="ListBullet"/>
-        <w:spacing w:after="80" w:line="276" w:lineRule="auto"/>
+        <w:spacing w:after="60" w:line="276" w:lineRule="auto"/>
+        <w:ind w:left="360"/>
         <w:jc w:val="both"/>
       </w:pPr>
       <w:r>
@@ -2162,8 +2175,8 @@
     </w:p>
     <w:p>
       <w:pPr>
-        <w:pStyle w:val="ListBullet"/>
-        <w:spacing w:after="80" w:line="276" w:lineRule="auto"/>
+        <w:spacing w:after="60" w:line="276" w:lineRule="auto"/>
+        <w:ind w:left="360"/>
         <w:jc w:val="both"/>
       </w:pPr>
       <w:r>
@@ -2186,8 +2199,8 @@
     </w:p>
     <w:p>
       <w:pPr>
-        <w:pStyle w:val="ListBullet"/>
-        <w:spacing w:after="80" w:line="276" w:lineRule="auto"/>
+        <w:spacing w:after="60" w:line="276" w:lineRule="auto"/>
+        <w:ind w:left="360"/>
         <w:jc w:val="both"/>
       </w:pPr>
       <w:r>
@@ -2210,8 +2223,8 @@
     </w:p>
     <w:p>
       <w:pPr>
-        <w:pStyle w:val="ListBullet"/>
-        <w:spacing w:after="80" w:line="276" w:lineRule="auto"/>
+        <w:spacing w:after="60" w:line="276" w:lineRule="auto"/>
+        <w:ind w:left="360"/>
         <w:jc w:val="both"/>
       </w:pPr>
       <w:r>
@@ -2234,8 +2247,8 @@
     </w:p>
     <w:p>
       <w:pPr>
-        <w:pStyle w:val="ListBullet"/>
-        <w:spacing w:after="80" w:line="276" w:lineRule="auto"/>
+        <w:spacing w:after="60" w:line="276" w:lineRule="auto"/>
+        <w:ind w:left="360"/>
         <w:jc w:val="both"/>
       </w:pPr>
       <w:r>
@@ -2258,14 +2271,15 @@
     </w:p>
     <w:p>
       <w:pPr>
+        <w:pStyle w:val="Heading2"/>
         <w:keepNext/>
-        <w:spacing w:before="240" w:after="120"/>
+        <w:spacing w:before="240" w:after="80"/>
       </w:pPr>
       <w:r>
         <w:rPr>
           <w:rFonts w:ascii="Calibri" w:hAnsi="Calibri"/>
           <w:b/>
-          <w:color w:val="1E293B"/>
+          <w:color w:val="000000"/>
           <w:sz w:val="24"/>
         </w:rPr>
         <w:t>4.3 Benefícios da Solução</w:t>
@@ -2284,7 +2298,7 @@
           <w:color w:val="0F172A"/>
           <w:sz w:val="22"/>
         </w:rPr>
-        <w:t xml:space="preserve">• Benefícios Tangíveis (Econômicos e Operacionais): </w:t>
+        <w:t xml:space="preserve">Benefícios Tangíveis (Econômicos e Operacionais): </w:t>
       </w:r>
       <w:r>
         <w:rPr>
@@ -2308,7 +2322,7 @@
           <w:color w:val="0F172A"/>
           <w:sz w:val="22"/>
         </w:rPr>
-        <w:t xml:space="preserve">• Benefícios Intangíveis (Estratégicos e Reputacionais): </w:t>
+        <w:t xml:space="preserve">Benefícios Intangíveis (Estratégicos e Reputacionais): </w:t>
       </w:r>
       <w:r>
         <w:rPr>
@@ -2321,14 +2335,15 @@
     </w:p>
     <w:p>
       <w:pPr>
+        <w:pStyle w:val="Heading2"/>
         <w:keepNext/>
-        <w:spacing w:before="240" w:after="120"/>
+        <w:spacing w:before="240" w:after="80"/>
       </w:pPr>
       <w:r>
         <w:rPr>
           <w:rFonts w:ascii="Calibri" w:hAnsi="Calibri"/>
           <w:b/>
-          <w:color w:val="1E293B"/>
+          <w:color w:val="000000"/>
           <w:sz w:val="24"/>
         </w:rPr>
         <w:t>4.4 Características da Solução</w:t>
@@ -2347,7 +2362,7 @@
           <w:color w:val="0F172A"/>
           <w:sz w:val="22"/>
         </w:rPr>
-        <w:t xml:space="preserve">• Acessibilidade Universal Web: </w:t>
+        <w:t xml:space="preserve">Acessibilidade Universal Web: </w:t>
       </w:r>
       <w:r>
         <w:rPr>
@@ -2371,7 +2386,7 @@
           <w:color w:val="0F172A"/>
           <w:sz w:val="22"/>
         </w:rPr>
-        <w:t xml:space="preserve">• Usabilidade 'Regra dos 3 Cliques' (RQ10): </w:t>
+        <w:t xml:space="preserve">Usabilidade 'Regra dos 3 Cliques' (RQ10): </w:t>
       </w:r>
       <w:r>
         <w:rPr>
@@ -2395,7 +2410,7 @@
           <w:color w:val="0F172A"/>
           <w:sz w:val="22"/>
         </w:rPr>
-        <w:t xml:space="preserve">• Controle de Acesso Baseado em Perfis (RBAC - RF27): </w:t>
+        <w:t xml:space="preserve">Controle de Acesso Baseado em Perfis (RBAC - RF27): </w:t>
       </w:r>
       <w:r>
         <w:rPr>
@@ -2419,7 +2434,7 @@
           <w:color w:val="0F172A"/>
           <w:sz w:val="22"/>
         </w:rPr>
-        <w:t xml:space="preserve">• Criptografia de Alta Entropia (RQ08): </w:t>
+        <w:t xml:space="preserve">Criptografia de Alta Entropia (RQ08): </w:t>
       </w:r>
       <w:r>
         <w:rPr>
@@ -2443,7 +2458,7 @@
           <w:color w:val="0F172A"/>
           <w:sz w:val="22"/>
         </w:rPr>
-        <w:t xml:space="preserve">• Arquitetura Híbrida e Resiliente (RQ15): </w:t>
+        <w:t xml:space="preserve">Arquitetura Híbrida e Resiliente (RQ15): </w:t>
       </w:r>
       <w:r>
         <w:rPr>
@@ -2456,14 +2471,15 @@
     </w:p>
     <w:p>
       <w:pPr>
+        <w:pStyle w:val="Heading2"/>
         <w:keepNext/>
-        <w:spacing w:before="240" w:after="120"/>
+        <w:spacing w:before="240" w:after="80"/>
       </w:pPr>
       <w:r>
         <w:rPr>
           <w:rFonts w:ascii="Calibri" w:hAnsi="Calibri"/>
           <w:b/>
-          <w:color w:val="1E293B"/>
+          <w:color w:val="000000"/>
           <w:sz w:val="24"/>
         </w:rPr>
         <w:t>4.5 Funcionalidades e Principais Requisitos Funcionais</w:t>
@@ -2486,8 +2502,8 @@
     </w:p>
     <w:p>
       <w:pPr>
-        <w:pStyle w:val="ListBullet"/>
-        <w:spacing w:after="80" w:line="276" w:lineRule="auto"/>
+        <w:spacing w:after="60" w:line="276" w:lineRule="auto"/>
+        <w:ind w:left="360"/>
         <w:jc w:val="both"/>
       </w:pPr>
       <w:r>
@@ -2510,8 +2526,8 @@
     </w:p>
     <w:p>
       <w:pPr>
-        <w:pStyle w:val="ListBullet"/>
-        <w:spacing w:after="80" w:line="276" w:lineRule="auto"/>
+        <w:spacing w:after="60" w:line="276" w:lineRule="auto"/>
+        <w:ind w:left="360"/>
         <w:jc w:val="both"/>
       </w:pPr>
       <w:r>
@@ -2534,8 +2550,8 @@
     </w:p>
     <w:p>
       <w:pPr>
-        <w:pStyle w:val="ListBullet"/>
-        <w:spacing w:after="80" w:line="276" w:lineRule="auto"/>
+        <w:spacing w:after="60" w:line="276" w:lineRule="auto"/>
+        <w:ind w:left="360"/>
         <w:jc w:val="both"/>
       </w:pPr>
       <w:r>
@@ -2558,8 +2574,8 @@
     </w:p>
     <w:p>
       <w:pPr>
-        <w:pStyle w:val="ListBullet"/>
-        <w:spacing w:after="80" w:line="276" w:lineRule="auto"/>
+        <w:spacing w:after="60" w:line="276" w:lineRule="auto"/>
+        <w:ind w:left="360"/>
         <w:jc w:val="both"/>
       </w:pPr>
       <w:r>
@@ -2582,8 +2598,8 @@
     </w:p>
     <w:p>
       <w:pPr>
-        <w:pStyle w:val="ListBullet"/>
-        <w:spacing w:after="80" w:line="276" w:lineRule="auto"/>
+        <w:spacing w:after="60" w:line="276" w:lineRule="auto"/>
+        <w:ind w:left="360"/>
         <w:jc w:val="both"/>
       </w:pPr>
       <w:r>
@@ -2606,8 +2622,8 @@
     </w:p>
     <w:p>
       <w:pPr>
-        <w:pStyle w:val="ListBullet"/>
-        <w:spacing w:after="80" w:line="276" w:lineRule="auto"/>
+        <w:spacing w:after="60" w:line="276" w:lineRule="auto"/>
+        <w:ind w:left="360"/>
         <w:jc w:val="both"/>
       </w:pPr>
       <w:r>
@@ -2630,8 +2646,8 @@
     </w:p>
     <w:p>
       <w:pPr>
-        <w:pStyle w:val="ListBullet"/>
-        <w:spacing w:after="80" w:line="276" w:lineRule="auto"/>
+        <w:spacing w:after="60" w:line="276" w:lineRule="auto"/>
+        <w:ind w:left="360"/>
         <w:jc w:val="both"/>
       </w:pPr>
       <w:r>
@@ -2654,8 +2670,8 @@
     </w:p>
     <w:p>
       <w:pPr>
-        <w:pStyle w:val="ListBullet"/>
-        <w:spacing w:after="80" w:line="276" w:lineRule="auto"/>
+        <w:spacing w:after="60" w:line="276" w:lineRule="auto"/>
+        <w:ind w:left="360"/>
         <w:jc w:val="both"/>
       </w:pPr>
       <w:r>
@@ -2678,8 +2694,8 @@
     </w:p>
     <w:p>
       <w:pPr>
-        <w:pStyle w:val="ListBullet"/>
-        <w:spacing w:after="80" w:line="276" w:lineRule="auto"/>
+        <w:spacing w:after="60" w:line="276" w:lineRule="auto"/>
+        <w:ind w:left="360"/>
         <w:jc w:val="both"/>
       </w:pPr>
       <w:r>
@@ -2702,8 +2718,8 @@
     </w:p>
     <w:p>
       <w:pPr>
-        <w:pStyle w:val="ListBullet"/>
-        <w:spacing w:after="80" w:line="276" w:lineRule="auto"/>
+        <w:spacing w:after="60" w:line="276" w:lineRule="auto"/>
+        <w:ind w:left="360"/>
         <w:jc w:val="both"/>
       </w:pPr>
       <w:r>
@@ -2726,8 +2742,8 @@
     </w:p>
     <w:p>
       <w:pPr>
-        <w:pStyle w:val="ListBullet"/>
-        <w:spacing w:after="80" w:line="276" w:lineRule="auto"/>
+        <w:spacing w:after="60" w:line="276" w:lineRule="auto"/>
+        <w:ind w:left="360"/>
         <w:jc w:val="both"/>
       </w:pPr>
       <w:r>
@@ -2750,14 +2766,15 @@
     </w:p>
     <w:p>
       <w:pPr>
+        <w:pStyle w:val="Heading2"/>
         <w:keepNext/>
-        <w:spacing w:before="240" w:after="120"/>
+        <w:spacing w:before="240" w:after="80"/>
       </w:pPr>
       <w:r>
         <w:rPr>
           <w:rFonts w:ascii="Calibri" w:hAnsi="Calibri"/>
           <w:b/>
-          <w:color w:val="1E293B"/>
+          <w:color w:val="000000"/>
           <w:sz w:val="24"/>
         </w:rPr>
         <w:t>4.6 Principais Requisitos de Qualidade (Não Funcionais)</w:t>
@@ -2791,7 +2808,7 @@
           <w:color w:val="0F172A"/>
           <w:sz w:val="22"/>
         </w:rPr>
-        <w:t xml:space="preserve">• Desempenho (RQ01): </w:t>
+        <w:t xml:space="preserve">Desempenho (RQ01): </w:t>
       </w:r>
       <w:r>
         <w:rPr>
@@ -2815,7 +2832,7 @@
           <w:color w:val="0F172A"/>
           <w:sz w:val="22"/>
         </w:rPr>
-        <w:t xml:space="preserve">• Confiabilidade (RQ02): </w:t>
+        <w:t xml:space="preserve">Confiabilidade (RQ02): </w:t>
       </w:r>
       <w:r>
         <w:rPr>
@@ -2839,7 +2856,7 @@
           <w:color w:val="0F172A"/>
           <w:sz w:val="22"/>
         </w:rPr>
-        <w:t xml:space="preserve">• Privacidade / LGPD (RQ03): </w:t>
+        <w:t xml:space="preserve">Privacidade / LGPD (RQ03): </w:t>
       </w:r>
       <w:r>
         <w:rPr>
@@ -2863,7 +2880,7 @@
           <w:color w:val="0F172A"/>
           <w:sz w:val="22"/>
         </w:rPr>
-        <w:t xml:space="preserve">• Compatibilidade (RQ04): </w:t>
+        <w:t xml:space="preserve">Compatibilidade (RQ04): </w:t>
       </w:r>
       <w:r>
         <w:rPr>
@@ -2887,7 +2904,7 @@
           <w:color w:val="0F172A"/>
           <w:sz w:val="22"/>
         </w:rPr>
-        <w:t xml:space="preserve">• Portabilidade (RQ05): </w:t>
+        <w:t xml:space="preserve">Portabilidade (RQ05): </w:t>
       </w:r>
       <w:r>
         <w:rPr>
@@ -2911,7 +2928,7 @@
           <w:color w:val="0F172A"/>
           <w:sz w:val="22"/>
         </w:rPr>
-        <w:t xml:space="preserve">• Segurança RBAC e Criptografia (RQ06, RQ07, RQ08, RQ09): </w:t>
+        <w:t xml:space="preserve">Segurança RBAC e Criptografia (RQ06, RQ07, RQ08, RQ09): </w:t>
       </w:r>
       <w:r>
         <w:rPr>
@@ -2935,7 +2952,7 @@
           <w:color w:val="0F172A"/>
           <w:sz w:val="22"/>
         </w:rPr>
-        <w:t xml:space="preserve">• Usabilidade (RQ10): </w:t>
+        <w:t xml:space="preserve">Usabilidade (RQ10): </w:t>
       </w:r>
       <w:r>
         <w:rPr>
@@ -2959,7 +2976,7 @@
           <w:color w:val="0F172A"/>
           <w:sz w:val="22"/>
         </w:rPr>
-        <w:t xml:space="preserve">• Tratamento de Exceções (RQ11): </w:t>
+        <w:t xml:space="preserve">Tratamento de Exceções (RQ11): </w:t>
       </w:r>
       <w:r>
         <w:rPr>
@@ -2983,7 +3000,7 @@
           <w:color w:val="0F172A"/>
           <w:sz w:val="22"/>
         </w:rPr>
-        <w:t xml:space="preserve">• Testabilidade (RQ13): </w:t>
+        <w:t xml:space="preserve">Testabilidade (RQ13): </w:t>
       </w:r>
       <w:r>
         <w:rPr>
@@ -3007,7 +3024,7 @@
           <w:color w:val="0F172A"/>
           <w:sz w:val="22"/>
         </w:rPr>
-        <w:t xml:space="preserve">• Auditoria Fiscal (RQ16): </w:t>
+        <w:t xml:space="preserve">Auditoria Fiscal (RQ16): </w:t>
       </w:r>
       <w:r>
         <w:rPr>
@@ -3020,14 +3037,15 @@
     </w:p>
     <w:p>
       <w:pPr>
+        <w:pStyle w:val="Heading1"/>
         <w:keepNext/>
-        <w:spacing w:before="320" w:after="160"/>
+        <w:spacing w:before="280" w:after="120"/>
       </w:pPr>
       <w:r>
         <w:rPr>
           <w:rFonts w:ascii="Calibri" w:hAnsi="Calibri"/>
           <w:b/>
-          <w:color w:val="0F172A"/>
+          <w:color w:val="000000"/>
           <w:sz w:val="28"/>
         </w:rPr>
         <w:t>5. Anexos</w:t>
@@ -3035,14 +3053,15 @@
     </w:p>
     <w:p>
       <w:pPr>
+        <w:pStyle w:val="Heading2"/>
         <w:keepNext/>
-        <w:spacing w:before="240" w:after="120"/>
+        <w:spacing w:before="240" w:after="80"/>
       </w:pPr>
       <w:r>
         <w:rPr>
           <w:rFonts w:ascii="Calibri" w:hAnsi="Calibri"/>
           <w:b/>
-          <w:color w:val="1E293B"/>
+          <w:color w:val="000000"/>
           <w:sz w:val="24"/>
         </w:rPr>
         <w:t>5.1 Modelos / Mapas de Processos de Negócio (Obrigatório)</w:t>
@@ -3065,15 +3084,16 @@
     </w:p>
     <w:p>
       <w:pPr>
+        <w:pStyle w:val="Heading3"/>
         <w:keepNext/>
-        <w:spacing w:before="160" w:after="80"/>
+        <w:spacing w:before="200" w:after="80"/>
       </w:pPr>
       <w:r>
         <w:rPr>
           <w:rFonts w:ascii="Calibri" w:hAnsi="Calibri"/>
           <w:b/>
           <w:i/>
-          <w:color w:val="334155"/>
+          <w:color w:val="000000"/>
           <w:sz w:val="22"/>
         </w:rPr>
         <w:t>5.1.1 Mapeamento do Processo Atual (AS-IS)</w:t>
@@ -3133,15 +3153,16 @@
     </w:p>
     <w:p>
       <w:pPr>
+        <w:pStyle w:val="Heading3"/>
         <w:keepNext/>
-        <w:spacing w:before="160" w:after="80"/>
+        <w:spacing w:before="200" w:after="80"/>
       </w:pPr>
       <w:r>
         <w:rPr>
           <w:rFonts w:ascii="Calibri" w:hAnsi="Calibri"/>
           <w:b/>
           <w:i/>
-          <w:color w:val="334155"/>
+          <w:color w:val="000000"/>
           <w:sz w:val="22"/>
         </w:rPr>
         <w:t>5.1.2 Mapeamento do Processo Proposto (TO-BE)</w:t>
@@ -3201,14 +3222,15 @@
     </w:p>
     <w:p>
       <w:pPr>
+        <w:pStyle w:val="Heading2"/>
         <w:keepNext/>
-        <w:spacing w:before="240" w:after="120"/>
+        <w:spacing w:before="240" w:after="80"/>
       </w:pPr>
       <w:r>
         <w:rPr>
           <w:rFonts w:ascii="Calibri" w:hAnsi="Calibri"/>
           <w:b/>
-          <w:color w:val="1E293B"/>
+          <w:color w:val="000000"/>
           <w:sz w:val="24"/>
         </w:rPr>
         <w:t>5.2 Protótipos de Tela (MVP Funcional Implementado)</w:t>
@@ -3242,7 +3264,7 @@
           <w:color w:val="0F172A"/>
           <w:sz w:val="22"/>
         </w:rPr>
-        <w:t xml:space="preserve">• Tela 1 — Acesso e Login RBAC: </w:t>
+        <w:t xml:space="preserve">Tela 1 — Acesso e Login RBAC: </w:t>
       </w:r>
       <w:r>
         <w:rPr>
@@ -3266,7 +3288,7 @@
           <w:color w:val="0F172A"/>
           <w:sz w:val="22"/>
         </w:rPr>
-        <w:t xml:space="preserve">• Tela 2 — Dashboard de Gestão: </w:t>
+        <w:t xml:space="preserve">Tela 2 — Dashboard de Gestão: </w:t>
       </w:r>
       <w:r>
         <w:rPr>
@@ -3290,7 +3312,7 @@
           <w:color w:val="0F172A"/>
           <w:sz w:val="22"/>
         </w:rPr>
-        <w:t xml:space="preserve">• Tela 3 — Grade de Agendamento: </w:t>
+        <w:t xml:space="preserve">Tela 3 — Grade de Agendamento: </w:t>
       </w:r>
       <w:r>
         <w:rPr>
@@ -3314,7 +3336,7 @@
           <w:color w:val="0F172A"/>
           <w:sz w:val="22"/>
         </w:rPr>
-        <w:t xml:space="preserve">• Tela 4 — Ficha de Pacientes: </w:t>
+        <w:t xml:space="preserve">Tela 4 — Ficha de Pacientes: </w:t>
       </w:r>
       <w:r>
         <w:rPr>
@@ -3338,7 +3360,7 @@
           <w:color w:val="0F172A"/>
           <w:sz w:val="22"/>
         </w:rPr>
-        <w:t xml:space="preserve">• Tela 5 — Prontuário Eletrônico: </w:t>
+        <w:t xml:space="preserve">Tela 5 — Prontuário Eletrônico: </w:t>
       </w:r>
       <w:r>
         <w:rPr>
@@ -3362,7 +3384,7 @@
           <w:color w:val="0F172A"/>
           <w:sz w:val="22"/>
         </w:rPr>
-        <w:t xml:space="preserve">• Tela 6 — Quitação e Pagamento Dividido: </w:t>
+        <w:t xml:space="preserve">Tela 6 — Quitação e Pagamento Dividido: </w:t>
       </w:r>
       <w:r>
         <w:rPr>
@@ -3386,7 +3408,7 @@
           <w:color w:val="0F172A"/>
           <w:sz w:val="22"/>
         </w:rPr>
-        <w:t xml:space="preserve">• Tela 7 — Ouvidoria e Avaliações: </w:t>
+        <w:t xml:space="preserve">Tela 7 — Ouvidoria e Avaliações: </w:t>
       </w:r>
       <w:r>
         <w:rPr>
@@ -3410,7 +3432,7 @@
           <w:color w:val="0F172A"/>
           <w:sz w:val="22"/>
         </w:rPr>
-        <w:t xml:space="preserve">• Tela 8 — Esteira Laboratorial: </w:t>
+        <w:t xml:space="preserve">Tela 8 — Esteira Laboratorial: </w:t>
       </w:r>
       <w:r>
         <w:rPr>
@@ -3423,14 +3445,15 @@
     </w:p>
     <w:p>
       <w:pPr>
+        <w:pStyle w:val="Heading2"/>
         <w:keepNext/>
-        <w:spacing w:before="240" w:after="120"/>
+        <w:spacing w:before="240" w:after="80"/>
       </w:pPr>
       <w:r>
         <w:rPr>
           <w:rFonts w:ascii="Calibri" w:hAnsi="Calibri"/>
           <w:b/>
-          <w:color w:val="1E293B"/>
+          <w:color w:val="000000"/>
           <w:sz w:val="24"/>
         </w:rPr>
         <w:t>5.3 Documentos de Referência</w:t>
@@ -3438,8 +3461,8 @@
     </w:p>
     <w:p>
       <w:pPr>
-        <w:pStyle w:val="ListBullet"/>
-        <w:spacing w:after="80" w:line="276" w:lineRule="auto"/>
+        <w:spacing w:after="60" w:line="276" w:lineRule="auto"/>
+        <w:ind w:left="360"/>
         <w:jc w:val="both"/>
       </w:pPr>
       <w:r>
@@ -3462,8 +3485,8 @@
     </w:p>
     <w:p>
       <w:pPr>
-        <w:pStyle w:val="ListBullet"/>
-        <w:spacing w:after="80" w:line="276" w:lineRule="auto"/>
+        <w:spacing w:after="60" w:line="276" w:lineRule="auto"/>
+        <w:ind w:left="360"/>
         <w:jc w:val="both"/>
       </w:pPr>
       <w:r>
@@ -3486,8 +3509,8 @@
     </w:p>
     <w:p>
       <w:pPr>
-        <w:pStyle w:val="ListBullet"/>
-        <w:spacing w:after="80" w:line="276" w:lineRule="auto"/>
+        <w:spacing w:after="60" w:line="276" w:lineRule="auto"/>
+        <w:ind w:left="360"/>
         <w:jc w:val="both"/>
       </w:pPr>
       <w:r>
@@ -3510,8 +3533,8 @@
     </w:p>
     <w:p>
       <w:pPr>
-        <w:pStyle w:val="ListBullet"/>
-        <w:spacing w:after="80" w:line="276" w:lineRule="auto"/>
+        <w:spacing w:after="60" w:line="276" w:lineRule="auto"/>
+        <w:ind w:left="360"/>
         <w:jc w:val="both"/>
       </w:pPr>
       <w:r>
@@ -3534,8 +3557,8 @@
     </w:p>
     <w:p>
       <w:pPr>
-        <w:pStyle w:val="ListBullet"/>
-        <w:spacing w:after="80" w:line="276" w:lineRule="auto"/>
+        <w:spacing w:after="60" w:line="276" w:lineRule="auto"/>
+        <w:ind w:left="360"/>
         <w:jc w:val="both"/>
       </w:pPr>
       <w:r>
@@ -3558,14 +3581,15 @@
     </w:p>
     <w:p>
       <w:pPr>
+        <w:pStyle w:val="Heading2"/>
         <w:keepNext/>
-        <w:spacing w:before="240" w:after="120"/>
+        <w:spacing w:before="240" w:after="80"/>
       </w:pPr>
       <w:r>
         <w:rPr>
           <w:rFonts w:ascii="Calibri" w:hAnsi="Calibri"/>
           <w:b/>
-          <w:color w:val="1E293B"/>
+          <w:color w:val="000000"/>
           <w:sz w:val="24"/>
         </w:rPr>
         <w:t>5.4 Outros — Síntese da Entrevista com a Cliente Amanda Souza Peixoto</w:t>
@@ -3599,7 +3623,7 @@
           <w:color w:val="0F172A"/>
           <w:sz w:val="22"/>
         </w:rPr>
-        <w:t xml:space="preserve">• Conflito de Horários: </w:t>
+        <w:t xml:space="preserve">Conflito de Horários: </w:t>
       </w:r>
       <w:r>
         <w:rPr>
@@ -3607,7 +3631,7 @@
           <w:color w:val="334155"/>
           <w:sz w:val="22"/>
         </w:rPr>
-        <w:t>'Muitas vezes duas pessoas chegam no mesmo horário porque anotamos errado na correria do balcão ou na planilha. Isso gera um constrangimento imenso.' ➜ Originou RF06, RN01 e RN02.</w:t>
+        <w:t>'Muitas vezes duas pessoas chegam no mesmo horário porque anotamos errado na correria do balcão ou na planilha. Isso gera um constrangimento imenso.' — Originou RF06, RN01 e RN02.</w:t>
       </w:r>
     </w:p>
     <w:p>
@@ -3623,7 +3647,7 @@
           <w:color w:val="0F172A"/>
           <w:sz w:val="22"/>
         </w:rPr>
-        <w:t xml:space="preserve">• Faltas sem Aviso: </w:t>
+        <w:t xml:space="preserve">Faltas sem Aviso: </w:t>
       </w:r>
       <w:r>
         <w:rPr>
@@ -3631,7 +3655,7 @@
           <w:color w:val="334155"/>
           <w:sz w:val="22"/>
         </w:rPr>
-        <w:t>'Se a secretária não mandar mensagem no dia anterior, quase um terço dos pacientes falta e a gente fica com a sala vazia sem faturar.' ➜ Originou RF12, RF13, RN03 e RN04.</w:t>
+        <w:t>'Se a secretária não mandar mensagem no dia anterior, quase um terço dos pacientes falta e a gente fica com a sala vazia sem faturar.' — Originou RF12, RF13, RN03 e RN04.</w:t>
       </w:r>
     </w:p>
     <w:p>
@@ -3647,7 +3671,7 @@
           <w:color w:val="0F172A"/>
           <w:sz w:val="22"/>
         </w:rPr>
-        <w:t xml:space="preserve">• Dificuldade com Endereços: </w:t>
+        <w:t xml:space="preserve">Dificuldade com Endereços: </w:t>
       </w:r>
       <w:r>
         <w:rPr>
@@ -3655,7 +3679,7 @@
           <w:color w:val="334155"/>
           <w:sz w:val="22"/>
         </w:rPr>
-        <w:t>'Na hora de preencher contrato e ficha, a pessoa demora para lembrar o CEP e o endereço todo. Se o sistema já puxasse pelo CEP adiantaria demais.' ➜ Originou RF29 e RN18.</w:t>
+        <w:t>'Na hora de preencher contrato e ficha, a pessoa demora para lembrar o CEP e o endereço todo. Se o sistema já puxasse pelo CEP adiantaria demais.' — Originou RF29 e RN18.</w:t>
       </w:r>
     </w:p>
     <w:p>
@@ -3671,7 +3695,7 @@
           <w:color w:val="0F172A"/>
           <w:sz w:val="22"/>
         </w:rPr>
-        <w:t xml:space="preserve">• Pagamentos Divididos: </w:t>
+        <w:t xml:space="preserve">Pagamentos Divididos: </w:t>
       </w:r>
       <w:r>
         <w:rPr>
@@ -3679,7 +3703,7 @@
           <w:color w:val="334155"/>
           <w:sz w:val="22"/>
         </w:rPr>
-        <w:t>'Em tratamentos mais caros, o paciente sempre pede: Posso dar R$ 150 no PIX agora e passar o resto no cartão em duas vezes? Hoje eu tenho que anotar isso em papel e no final do mês é uma confusão para bater o caixa.' ➜ Originou RF30 e RN19.</w:t>
+        <w:t>'Em tratamentos mais caros, o paciente sempre pede: Posso dar R$ 150 no PIX agora e passar o resto no cartão em duas vezes? Hoje eu tenho que anotar isso em papel e no final do mês é uma confusão para bater o caixa.' — Originou RF30 e RN19.</w:t>
       </w:r>
     </w:p>
     <w:p>
@@ -3695,7 +3719,7 @@
           <w:color w:val="0F172A"/>
           <w:sz w:val="22"/>
         </w:rPr>
-        <w:t xml:space="preserve">• Falta de Métricas de Cancelamento: </w:t>
+        <w:t xml:space="preserve">Falta de Métricas de Cancelamento: </w:t>
       </w:r>
       <w:r>
         <w:rPr>
@@ -3703,7 +3727,7 @@
           <w:color w:val="334155"/>
           <w:sz w:val="22"/>
         </w:rPr>
-        <w:t>'A gente não tem o dado exato de desistência de consultas. Saber o porquê o paciente desmarcou ajudaria a entender se é o preço ou o horário.' ➜ Originou RF31 e RN20.</w:t>
+        <w:t>'A gente não tem o dado exato de desistência de consultas. Saber o porquê o paciente desmarcou ajudaria a entender se é o preço ou o horário.' — Originou RF31 e RN20.</w:t>
       </w:r>
     </w:p>
     <w:p>
@@ -3719,7 +3743,7 @@
           <w:color w:val="0F172A"/>
           <w:sz w:val="22"/>
         </w:rPr>
-        <w:t xml:space="preserve">• Satisfação e Ouvidoria: </w:t>
+        <w:t xml:space="preserve">Satisfação e Ouvidoria: </w:t>
       </w:r>
       <w:r>
         <w:rPr>
@@ -3727,7 +3751,7 @@
           <w:color w:val="334155"/>
           <w:sz w:val="22"/>
         </w:rPr>
-        <w:t>'Eu gostaria de ter uma ouvidoria, mesmo que simples, para saber como está o atendimento da recepção, a limpeza e a consulta.' ➜ Originou RF32 e RN21.</w:t>
+        <w:t>'Eu gostaria de ter uma ouvidoria, mesmo que simples, para saber como está o atendimento da recepção, a limpeza e a consulta.' — Originou RF32 e RN21.</w:t>
       </w:r>
     </w:p>
     <w:p>
@@ -3743,7 +3767,7 @@
           <w:color w:val="0F172A"/>
           <w:sz w:val="22"/>
         </w:rPr>
-        <w:t xml:space="preserve">• Retorno Preventivo Semestral: </w:t>
+        <w:t xml:space="preserve">Retorno Preventivo Semestral: </w:t>
       </w:r>
       <w:r>
         <w:rPr>
@@ -3751,7 +3775,7 @@
           <w:color w:val="334155"/>
           <w:sz w:val="22"/>
         </w:rPr>
-        <w:t>'O paciente faz o procedimento e esquece de voltar em 6 meses. Se a gente tivesse como puxar quem não volta há 6 meses e mandar um WhatsApp com um desconto de 10%, muitos voltariam.' ➜ Originou RF33 e RN22.</w:t>
+        <w:t>'O paciente faz o procedimento e esquece de voltar em 6 meses. Se a gente tivesse como puxar quem não volta há 6 meses e mandar um WhatsApp com um desconto de 10%, muitos voltariam.' — Originou RF33 e RN22.</w:t>
       </w:r>
     </w:p>
     <w:p>
@@ -3767,7 +3791,7 @@
           <w:color w:val="0F172A"/>
           <w:sz w:val="22"/>
         </w:rPr>
-        <w:t xml:space="preserve">• Atrasos de Laudos de Laboratório: </w:t>
+        <w:t xml:space="preserve">Atrasos de Laudos de Laboratório: </w:t>
       </w:r>
       <w:r>
         <w:rPr>
@@ -3775,7 +3799,7 @@
           <w:color w:val="334155"/>
           <w:sz w:val="22"/>
         </w:rPr>
-        <w:t>'Muitas vezes a recepcionista marca o retorno do paciente sem saber se o exame que foi para o laboratório externo já ficou pronto. Aí o paciente vem à toa.' ➜ Originou RF34 e RN23.</w:t>
+        <w:t>'Muitas vezes a recepcionista marca o retorno do paciente sem saber se o exame que foi para o laboratório externo já ficou pronto. Aí o paciente vem à toa.' — Originou RF34 e RN23.</w:t>
       </w:r>
     </w:p>
     <w:sectPr>

</xml_diff>